<commit_message>
Updated report and README
</commit_message>
<xml_diff>
--- a/reports.docx
+++ b/reports.docx
@@ -40,7 +40,7 @@
     <w:p>
       <w:r>
         <w:pict w14:anchorId="2D67C9A0">
-          <v:rect id="_x0000_i1109" style="width:0;height:1.5pt" o:hralign="center" o:hrstd="t" o:hr="t" fillcolor="#a0a0a0" stroked="f"/>
+          <v:rect id="_x0000_i1025" style="width:0;height:1.5pt" o:hralign="center" o:hrstd="t" o:hr="t" fillcolor="#a0a0a0" stroked="f"/>
         </w:pict>
       </w:r>
     </w:p>
@@ -61,7 +61,12 @@
     </w:p>
     <w:p>
       <w:r>
-        <w:t xml:space="preserve">A dataset of 100 user-generated product-style reviews was created to simulate real-world e-commerce reviews. The dataset contains a single column named </w:t>
+        <w:t>The dataset used in this project consists of 100 product-style reviews designed to simulate real-world e-commerce user feedback. It includes both positive and negative opinions expressed in short textual format.</w:t>
+      </w:r>
+    </w:p>
+    <w:p>
+      <w:r>
+        <w:t xml:space="preserve">The dataset contains a single column, </w:t>
       </w:r>
       <w:r>
         <w:rPr>
@@ -71,13 +76,19 @@
         <w:t>review_text</w:t>
       </w:r>
       <w:r>
-        <w:t>, which includes positive and negative opinions about products.</w:t>
-      </w:r>
-    </w:p>
+        <w:t>, which serves as the input for text preprocessing and feature engineering tasks.</w:t>
+      </w:r>
+    </w:p>
+    <w:p>
+      <w:r>
+        <w:t>This dataset was created for demonstration purposes to focus on techniques such as text cleaning, vocabulary creation, and feature extraction. In real-world applications, similar data can be collected from e-commerce platforms using web scraping tools like Selenium or BeautifulSoup.</w:t>
+      </w:r>
+    </w:p>
+    <w:p/>
     <w:p>
       <w:r>
         <w:pict w14:anchorId="01AEBA2C">
-          <v:rect id="_x0000_i1110" style="width:0;height:1.5pt" o:hralign="center" o:hrstd="t" o:hr="t" fillcolor="#a0a0a0" stroked="f"/>
+          <v:rect id="_x0000_i1026" style="width:0;height:1.5pt" o:hralign="center" o:hrstd="t" o:hr="t" fillcolor="#a0a0a0" stroked="f"/>
         </w:pict>
       </w:r>
     </w:p>
@@ -162,6 +173,7 @@
         <w:rPr>
           <w:noProof/>
         </w:rPr>
+        <w:lastRenderedPageBreak/>
         <w:drawing>
           <wp:inline distT="0" distB="0" distL="0" distR="0" wp14:anchorId="12EDADAE" wp14:editId="749AB35C">
             <wp:extent cx="5772150" cy="3246754"/>
@@ -215,7 +227,7 @@
     <w:p>
       <w:r>
         <w:pict w14:anchorId="2728EE0F">
-          <v:rect id="_x0000_i1111" style="width:0;height:1.5pt" o:hralign="center" o:hrstd="t" o:hr="t" fillcolor="#a0a0a0" stroked="f"/>
+          <v:rect id="_x0000_i1027" style="width:0;height:1.5pt" o:hralign="center" o:hrstd="t" o:hr="t" fillcolor="#a0a0a0" stroked="f"/>
         </w:pict>
       </w:r>
     </w:p>
@@ -225,7 +237,6 @@
           <w:b/>
           <w:bCs/>
         </w:rPr>
-        <w:lastRenderedPageBreak/>
         <w:t>Task 2: Vocabulary Creation</w:t>
       </w:r>
       <w:r>
@@ -295,17 +306,8 @@
           <w:b/>
           <w:bCs/>
         </w:rPr>
-        <w:t xml:space="preserve">Task </w:t>
-      </w:r>
-      <w:proofErr w:type="gramStart"/>
-      <w:r>
-        <w:rPr>
-          <w:b/>
-          <w:bCs/>
-        </w:rPr>
-        <w:t>3 :</w:t>
-      </w:r>
-      <w:proofErr w:type="gramEnd"/>
+        <w:t>Task 3 :</w:t>
+      </w:r>
       <w:r>
         <w:rPr>
           <w:b/>
@@ -346,6 +348,7 @@
         <w:rPr>
           <w:noProof/>
         </w:rPr>
+        <w:lastRenderedPageBreak/>
         <w:drawing>
           <wp:inline distT="0" distB="0" distL="0" distR="0" wp14:anchorId="14691F8C" wp14:editId="63E36556">
             <wp:extent cx="5731510" cy="3223895"/>
@@ -399,7 +402,7 @@
     <w:p>
       <w:r>
         <w:pict w14:anchorId="68417CE5">
-          <v:rect id="_x0000_i1112" style="width:0;height:1.5pt" o:hralign="center" o:hrstd="t" o:hr="t" fillcolor="#a0a0a0" stroked="f"/>
+          <v:rect id="_x0000_i1028" style="width:0;height:1.5pt" o:hralign="center" o:hrstd="t" o:hr="t" fillcolor="#a0a0a0" stroked="f"/>
         </w:pict>
       </w:r>
     </w:p>
@@ -427,7 +430,6 @@
     </w:p>
     <w:p>
       <w:r>
-        <w:lastRenderedPageBreak/>
         <w:t>Bag of Words converts text into numerical form by counting the frequency of each word in a document. It is simple and effective but ignores word order and meaning.</w:t>
       </w:r>
     </w:p>
@@ -489,7 +491,7 @@
     <w:p>
       <w:r>
         <w:pict w14:anchorId="3361424F">
-          <v:rect id="_x0000_i1113" style="width:0;height:1.5pt" o:hralign="center" o:hrstd="t" o:hr="t" fillcolor="#a0a0a0" stroked="f"/>
+          <v:rect id="_x0000_i1029" style="width:0;height:1.5pt" o:hralign="center" o:hrstd="t" o:hr="t" fillcolor="#a0a0a0" stroked="f"/>
         </w:pict>
       </w:r>
     </w:p>
@@ -525,6 +527,7 @@
         <w:rPr>
           <w:noProof/>
         </w:rPr>
+        <w:lastRenderedPageBreak/>
         <w:drawing>
           <wp:inline distT="0" distB="0" distL="0" distR="0" wp14:anchorId="19F4954C" wp14:editId="4C44325A">
             <wp:extent cx="5731510" cy="3223895"/>
@@ -578,7 +581,7 @@
     <w:p>
       <w:r>
         <w:pict w14:anchorId="35399C14">
-          <v:rect id="_x0000_i1114" style="width:0;height:1.5pt" o:hralign="center" o:hrstd="t" o:hr="t" fillcolor="#a0a0a0" stroked="f"/>
+          <v:rect id="_x0000_i1030" style="width:0;height:1.5pt" o:hralign="center" o:hrstd="t" o:hr="t" fillcolor="#a0a0a0" stroked="f"/>
         </w:pict>
       </w:r>
     </w:p>
@@ -594,17 +597,8 @@
           <w:b/>
           <w:bCs/>
         </w:rPr>
-        <w:t xml:space="preserve">Task </w:t>
-      </w:r>
-      <w:proofErr w:type="gramStart"/>
-      <w:r>
-        <w:rPr>
-          <w:b/>
-          <w:bCs/>
-        </w:rPr>
-        <w:t>4 :</w:t>
-      </w:r>
-      <w:proofErr w:type="gramEnd"/>
+        <w:t>Task 4 :</w:t>
+      </w:r>
       <w:r>
         <w:rPr>
           <w:b/>
@@ -667,7 +661,6 @@
                 <w:b/>
                 <w:bCs/>
               </w:rPr>
-              <w:lastRenderedPageBreak/>
               <w:t>Feature</w:t>
             </w:r>
           </w:p>
@@ -1616,7 +1609,7 @@
     <w:p>
       <w:r>
         <w:pict w14:anchorId="7E257AC3">
-          <v:rect id="_x0000_i1115" style="width:0;height:1.5pt" o:hralign="center" o:hrstd="t" o:hr="t" fillcolor="#a0a0a0" stroked="f"/>
+          <v:rect id="_x0000_i1031" style="width:0;height:1.5pt" o:hralign="center" o:hrstd="t" o:hr="t" fillcolor="#a0a0a0" stroked="f"/>
         </w:pict>
       </w:r>
     </w:p>
@@ -1634,6 +1627,7 @@
         <w:rPr>
           <w:noProof/>
         </w:rPr>
+        <w:lastRenderedPageBreak/>
         <w:drawing>
           <wp:inline distT="0" distB="0" distL="0" distR="0" wp14:anchorId="6A22847C" wp14:editId="7B4CCC3D">
             <wp:extent cx="5731510" cy="3028950"/>
@@ -1752,21 +1746,21 @@
     <w:p>
       <w:r>
         <w:pict w14:anchorId="7EE38053">
-          <v:rect id="_x0000_i1116" style="width:0;height:1.5pt" o:hralign="center" o:hrstd="t" o:hr="t" fillcolor="#a0a0a0" stroked="f"/>
+          <v:rect id="_x0000_i1032" style="width:0;height:1.5pt" o:hralign="center" o:hrstd="t" o:hr="t" fillcolor="#a0a0a0" stroked="f"/>
         </w:pict>
       </w:r>
     </w:p>
     <w:p>
       <w:r>
+        <w:t>The feature matrices generated using BoW and TF-IDF were sparse, meaning most values were zero. Sparse matrices are inefficient for large-scale systems because they consume memory unnecessarily and increase computational cost.</w:t>
+      </w:r>
+    </w:p>
+    <w:p>
+      <w:r>
+        <w:rPr>
+          <w:noProof/>
+        </w:rPr>
         <w:lastRenderedPageBreak/>
-        <w:t>The feature matrices generated using BoW and TF-IDF were sparse, meaning most values were zero. Sparse matrices are inefficient for large-scale systems because they consume memory unnecessarily and increase computational cost.</w:t>
-      </w:r>
-    </w:p>
-    <w:p>
-      <w:r>
-        <w:rPr>
-          <w:noProof/>
-        </w:rPr>
         <w:drawing>
           <wp:inline distT="0" distB="0" distL="0" distR="0" wp14:anchorId="1B93A313" wp14:editId="0C357EC4">
             <wp:extent cx="5731510" cy="3223895"/>
@@ -1820,7 +1814,7 @@
     <w:p>
       <w:r>
         <w:pict w14:anchorId="78BEE929">
-          <v:rect id="_x0000_i1117" style="width:0;height:1.5pt" o:hralign="center" o:hrstd="t" o:hr="t" fillcolor="#a0a0a0" stroked="f"/>
+          <v:rect id="_x0000_i1033" style="width:0;height:1.5pt" o:hralign="center" o:hrstd="t" o:hr="t" fillcolor="#a0a0a0" stroked="f"/>
         </w:pict>
       </w:r>
     </w:p>
@@ -1869,7 +1863,7 @@
     <w:p>
       <w:r>
         <w:pict w14:anchorId="4F03B138">
-          <v:rect id="_x0000_i1118" style="width:0;height:1.5pt" o:hralign="center" o:hrstd="t" o:hr="t" fillcolor="#a0a0a0" stroked="f"/>
+          <v:rect id="_x0000_i1034" style="width:0;height:1.5pt" o:hralign="center" o:hrstd="t" o:hr="t" fillcolor="#a0a0a0" stroked="f"/>
         </w:pict>
       </w:r>
     </w:p>
@@ -1896,7 +1890,7 @@
     <w:p>
       <w:r>
         <w:pict w14:anchorId="5BB29DC3">
-          <v:rect id="_x0000_i1119" style="width:0;height:1.5pt" o:hralign="center" o:hrstd="t" o:hr="t" fillcolor="#a0a0a0" stroked="f"/>
+          <v:rect id="_x0000_i1035" style="width:0;height:1.5pt" o:hralign="center" o:hrstd="t" o:hr="t" fillcolor="#a0a0a0" stroked="f"/>
         </w:pict>
       </w:r>
     </w:p>
@@ -1923,7 +1917,7 @@
     <w:p>
       <w:r>
         <w:pict w14:anchorId="6E5B3BAC">
-          <v:rect id="_x0000_i1120" style="width:0;height:1.5pt" o:hralign="center" o:hrstd="t" o:hr="t" fillcolor="#a0a0a0" stroked="f"/>
+          <v:rect id="_x0000_i1036" style="width:0;height:1.5pt" o:hralign="center" o:hrstd="t" o:hr="t" fillcolor="#a0a0a0" stroked="f"/>
         </w:pict>
       </w:r>
     </w:p>
@@ -1973,41 +1967,41 @@
         </w:numPr>
       </w:pPr>
       <w:r>
+        <w:t>TF-IDF achieved slightly better performance due to better feature weighting</w:t>
+      </w:r>
+    </w:p>
+    <w:p>
+      <w:r>
+        <w:pict w14:anchorId="3D0D1CA9">
+          <v:rect id="_x0000_i1037" style="width:0;height:1.5pt" o:hralign="center" o:hrstd="t" o:hr="t" fillcolor="#a0a0a0" stroked="f"/>
+        </w:pict>
+      </w:r>
+    </w:p>
+    <w:p>
+      <w:pPr>
+        <w:rPr>
+          <w:b/>
+          <w:bCs/>
+        </w:rPr>
+      </w:pPr>
+      <w:r>
+        <w:rPr>
+          <w:b/>
+          <w:bCs/>
+        </w:rPr>
+        <w:t xml:space="preserve"> Conclusion</w:t>
+      </w:r>
+    </w:p>
+    <w:p>
+      <w:r>
         <w:lastRenderedPageBreak/>
-        <w:t>TF-IDF achieved slightly better performance due to better feature weighting</w:t>
-      </w:r>
-    </w:p>
-    <w:p>
-      <w:r>
-        <w:pict w14:anchorId="3D0D1CA9">
-          <v:rect id="_x0000_i1121" style="width:0;height:1.5pt" o:hralign="center" o:hrstd="t" o:hr="t" fillcolor="#a0a0a0" stroked="f"/>
-        </w:pict>
-      </w:r>
-    </w:p>
-    <w:p>
-      <w:pPr>
-        <w:rPr>
-          <w:b/>
-          <w:bCs/>
-        </w:rPr>
-      </w:pPr>
-      <w:r>
-        <w:rPr>
-          <w:b/>
-          <w:bCs/>
-        </w:rPr>
-        <w:t xml:space="preserve"> Conclusion</w:t>
-      </w:r>
-    </w:p>
-    <w:p>
-      <w:r>
         <w:t>This project demonstrated how text data can be transformed into numerical features using different techniques. Among the methods used, TF-IDF proved to be more effective than Bag of Words as it captures the importance of words. However, both methods have limitations in understanding semantic meaning, which can be improved using advanced NLP techniques.</w:t>
       </w:r>
     </w:p>
     <w:p>
       <w:r>
         <w:pict w14:anchorId="3B115DE1">
-          <v:rect id="_x0000_i1122" style="width:0;height:1.5pt" o:hralign="center" o:hrstd="t" o:hr="t" fillcolor="#a0a0a0" stroked="f"/>
+          <v:rect id="_x0000_i1038" style="width:0;height:1.5pt" o:hralign="center" o:hrstd="t" o:hr="t" fillcolor="#a0a0a0" stroked="f"/>
         </w:pict>
       </w:r>
     </w:p>

</xml_diff>